<commit_message>
Add grader app, requirements, gitignore, and update grading outputs
- Replace general_grader.py with grader_app.py (new API version)
- Add requirements.txt and env.example
- Rename gitignore -> .gitignore and add .env-* pattern to prevent committing env backups
- Update graded output xlsx files and rubric
- Add auto_push_grading_log.ps1 script

Co-Authored-By: Claude Sonnet 4.6 <noreply@anthropic.com>
</commit_message>
<xml_diff>
--- a/AI_Grading_Project/Revised_Rubric_Aug2025.docx
+++ b/AI_Grading_Project/Revised_Rubric_Aug2025.docx
@@ -5622,18 +5622,18 @@
 </file>
 
 <file path=customXml/item1.xml><?xml version="1.0" encoding="utf-8"?>
-<p:properties xmlns:p="http://schemas.microsoft.com/office/2006/metadata/properties" xmlns:xsi="http://www.w3.org/2001/XMLSchema-instance" xmlns:pc="http://schemas.microsoft.com/office/infopath/2007/PartnerControls">
-  <documentManagement/>
-</p:properties>
-</file>
-
-<file path=customXml/item2.xml><?xml version="1.0" encoding="utf-8"?>
 <?mso-contentType ?>
 <FormTemplates xmlns="http://schemas.microsoft.com/sharepoint/v3/contenttype/forms">
   <Display>DocumentLibraryForm</Display>
   <Edit>DocumentLibraryForm</Edit>
   <New>DocumentLibraryForm</New>
 </FormTemplates>
+</file>
+
+<file path=customXml/item2.xml><?xml version="1.0" encoding="utf-8"?>
+<p:properties xmlns:p="http://schemas.microsoft.com/office/2006/metadata/properties" xmlns:xsi="http://www.w3.org/2001/XMLSchema-instance" xmlns:pc="http://schemas.microsoft.com/office/infopath/2007/PartnerControls">
+  <documentManagement/>
+</p:properties>
 </file>
 
 <file path=customXml/item3.xml><?xml version="1.0" encoding="utf-8"?>
@@ -5775,23 +5775,6 @@
 </file>
 
 <file path=customXml/itemProps1.xml><?xml version="1.0" encoding="utf-8"?>
-<ds:datastoreItem xmlns:ds="http://schemas.openxmlformats.org/officeDocument/2006/customXml" ds:itemID="{5958C62F-A62C-49CC-97A0-A39FB53BD6F1}">
-  <ds:schemaRefs>
-    <ds:schemaRef ds:uri="http://purl.org/dc/terms/"/>
-    <ds:schemaRef ds:uri="b0298d3b-99bd-41ef-ab0c-1b3b0fcf77a4"/>
-    <ds:schemaRef ds:uri="http://schemas.microsoft.com/office/infopath/2007/PartnerControls"/>
-    <ds:schemaRef ds:uri="http://schemas.openxmlformats.org/package/2006/metadata/core-properties"/>
-    <ds:schemaRef ds:uri="http://www.w3.org/XML/1998/namespace"/>
-    <ds:schemaRef ds:uri="http://purl.org/dc/elements/1.1/"/>
-    <ds:schemaRef ds:uri="http://schemas.microsoft.com/office/2006/metadata/properties"/>
-    <ds:schemaRef ds:uri="http://schemas.microsoft.com/office/2006/documentManagement/types"/>
-    <ds:schemaRef ds:uri="56eb7651-b80f-46a9-b839-f7a8cf352fe2"/>
-    <ds:schemaRef ds:uri="http://purl.org/dc/dcmitype/"/>
-  </ds:schemaRefs>
-</ds:datastoreItem>
-</file>
-
-<file path=customXml/itemProps2.xml><?xml version="1.0" encoding="utf-8"?>
 <ds:datastoreItem xmlns:ds="http://schemas.openxmlformats.org/officeDocument/2006/customXml" ds:itemID="{9F267762-21FE-4BA2-B083-95376D6A1DF2}">
   <ds:schemaRefs>
     <ds:schemaRef ds:uri="http://schemas.microsoft.com/sharepoint/v3/contenttype/forms"/>
@@ -5799,6 +5782,29 @@
 </ds:datastoreItem>
 </file>
 
+<file path=customXml/itemProps2.xml><?xml version="1.0" encoding="utf-8"?>
+<ds:datastoreItem xmlns:ds="http://schemas.openxmlformats.org/officeDocument/2006/customXml" ds:itemID="{5958C62F-A62C-49CC-97A0-A39FB53BD6F1}">
+  <ds:schemaRefs>
+    <ds:schemaRef ds:uri="http://schemas.microsoft.com/office/2006/metadata/properties"/>
+    <ds:schemaRef ds:uri="http://schemas.microsoft.com/office/infopath/2007/PartnerControls"/>
+  </ds:schemaRefs>
+</ds:datastoreItem>
+</file>
+
 <file path=customXml/itemProps3.xml><?xml version="1.0" encoding="utf-8"?>
-<ds:datastoreItem xmlns:ds="http://schemas.openxmlformats.org/officeDocument/2006/customXml" ds:itemID="{DF106697-463C-4952-93D2-E719770E44E5}"/>
+<ds:datastoreItem xmlns:ds="http://schemas.openxmlformats.org/officeDocument/2006/customXml" ds:itemID="{DF106697-463C-4952-93D2-E719770E44E5}">
+  <ds:schemaRefs>
+    <ds:schemaRef ds:uri="http://schemas.microsoft.com/office/2006/metadata/contentType"/>
+    <ds:schemaRef ds:uri="http://schemas.microsoft.com/office/2006/metadata/properties/metaAttributes"/>
+    <ds:schemaRef ds:uri="http://www.w3.org/2001/XMLSchema"/>
+    <ds:schemaRef ds:uri="http://schemas.microsoft.com/office/2006/metadata/properties"/>
+    <ds:schemaRef ds:uri="fd6c693f-1843-43af-b35c-d02a58130b8b"/>
+    <ds:schemaRef ds:uri="http://schemas.microsoft.com/office/2006/documentManagement/types"/>
+    <ds:schemaRef ds:uri="http://schemas.microsoft.com/office/infopath/2007/PartnerControls"/>
+    <ds:schemaRef ds:uri="http://schemas.openxmlformats.org/package/2006/metadata/core-properties"/>
+    <ds:schemaRef ds:uri="http://purl.org/dc/elements/1.1/"/>
+    <ds:schemaRef ds:uri="http://purl.org/dc/terms/"/>
+    <ds:schemaRef ds:uri="http://schemas.microsoft.com/internal/obd"/>
+  </ds:schemaRefs>
+</ds:datastoreItem>
 </file>
</xml_diff>